<commit_message>
Drop remaining architecture/ownership claims, update CV
- Experience note no longer claims "Full ownership … architecture";
  now "Hands-on across production systems — AI/LLM features, data
  pipelines, containerized deployment, and CI/CD" in both languages.
- Replace the bundled CV with a corrected copy: headline realigned to
  "AI Engineer · Backend & Full-Stack", "who designs" → "who builds",
  "each taken from architecture to enterprise deployment" → "each
  shipped through to enterprise deployment", and the Architected /
  Designed bullet verbs → "Worked on".

The .docx was edited in place at the XML level rather than regenerated
from the markdown, because the two had diverged — the .docx carried
hand edits (AI Software Engineer, "& Frontend") the markdown lacked.
Every other part of the archive is byte-identical to the original.
</commit_message>
<xml_diff>
--- a/frontend/web/public/Vako_Mardaleishvili_CV.docx
+++ b/frontend/web/public/Vako_Mardaleishvili_CV.docx
@@ -51,7 +51,7 @@
           <w:color w:val="5A6472"/>
           <w:spacing w:val="10"/>
         </w:rPr>
-        <w:t>Backend &amp; AI Engineer  ·  Python · Distributed Systems · Applied ML/LLM</w:t>
+        <w:t>AI Engineer  ·  Backend &amp; Full-Stack  ·  Python · React / React Native · Applied LLM/ML</w:t>
       </w:r>
     </w:p>
     <w:p>
@@ -114,7 +114,7 @@
           <w:sz w:val="19"/>
           <w:szCs w:val="19"/>
         </w:rPr>
-        <w:t xml:space="preserve">Backend &amp; AI engineer who designs production-grade, </w:t>
+        <w:t xml:space="preserve">AI engineer who builds production-grade, </w:t>
       </w:r>
       <w:r>
         <w:rPr>
@@ -204,7 +204,7 @@
           <w:sz w:val="19"/>
           <w:szCs w:val="19"/>
         </w:rPr>
-        <w:t xml:space="preserve"> clients. Delivered five production systems across media intelligence, real-time speech, agentic AI, and geospatial data — each taken from architecture to enterprise deployment.</w:t>
+        <w:t xml:space="preserve"> clients. Delivered five production systems across media intelligence, real-time speech, agentic AI, and geospatial data — each shipped through to enterprise deployment.</w:t>
       </w:r>
     </w:p>
     <w:p>
@@ -457,7 +457,7 @@
           <w:sz w:val="19"/>
           <w:szCs w:val="19"/>
         </w:rPr>
-        <w:t>Architected</w:t>
+        <w:t>Worked on</w:t>
       </w:r>
       <w:r>
         <w:rPr>
@@ -809,7 +809,7 @@
           <w:sz w:val="19"/>
           <w:szCs w:val="19"/>
         </w:rPr>
-        <w:t>Designed</w:t>
+        <w:t>Worked on</w:t>
       </w:r>
       <w:r>
         <w:rPr>

</xml_diff>

<commit_message>
Broaden CV AI framing: any model, local or API-hosted
Headline gains "(local & API models)"; the summary states that he works
with any model, local or API-based, and integrates it into whatever
system needs it — matching the site's AI block. Technical Skills gains a
leading "AI / LLM Engineering" line (LangGraph, LangChain, LangSmith,
Hugging Face, Ollama, Mistral, NVIDIA NeMo, RAG, prompt engineering,
OpenAI / Azure OpenAI); the AI entries are removed from "Frameworks &
Libraries" so nothing is listed twice.
</commit_message>
<xml_diff>
--- a/frontend/web/public/Vako_Mardaleishvili_CV.docx
+++ b/frontend/web/public/Vako_Mardaleishvili_CV.docx
@@ -51,7 +51,7 @@
           <w:color w:val="5A6472"/>
           <w:spacing w:val="10"/>
         </w:rPr>
-        <w:t>AI Engineer  ·  Backend &amp; Full-Stack  ·  Python · React / React Native · Applied LLM/ML</w:t>
+        <w:t>AI Engineer  ·  Backend &amp; Full-Stack  ·  Python · React / React Native · Applied LLM/ML (local &amp; API models)</w:t>
       </w:r>
     </w:p>
     <w:p>
@@ -150,7 +150,7 @@
           <w:sz w:val="19"/>
           <w:szCs w:val="19"/>
         </w:rPr>
-        <w:t xml:space="preserve">. Ships end-to-end: async </w:t>
+        <w:t xml:space="preserve">. Works with any model, local or API-based, and integrates it into whatever system needs it. Ships end-to-end: async </w:t>
       </w:r>
       <w:r>
         <w:rPr>
@@ -239,14 +239,14 @@
           <w:sz w:val="19"/>
           <w:szCs w:val="19"/>
         </w:rPr>
-        <w:t xml:space="preserve">Languages:  </w:t>
-      </w:r>
-      <w:r>
-        <w:rPr>
-          <w:sz w:val="19"/>
-          <w:szCs w:val="19"/>
-        </w:rPr>
-        <w:t>Python, TypeScript, JavaScript, SQL, Bash</w:t>
+        <w:t xml:space="preserve">AI / LLM Engineering:  </w:t>
+      </w:r>
+      <w:r>
+        <w:rPr>
+          <w:sz w:val="19"/>
+          <w:szCs w:val="19"/>
+        </w:rPr>
+        <w:t>LangGraph, LangChain, LangSmith, Hugging Face, Ollama, Mistral, NVIDIA NeMo (TitaNet / FastConformer), faster-whisper, pyannote, RAG &amp; vector retrieval, multi-agent orchestration, prompt engineering, OpenAI / Azure OpenAI — local or API-hosted models</w:t>
       </w:r>
     </w:p>
     <w:p>
@@ -262,6 +262,29 @@
           <w:sz w:val="19"/>
           <w:szCs w:val="19"/>
         </w:rPr>
+        <w:t xml:space="preserve">Languages:  </w:t>
+      </w:r>
+      <w:r>
+        <w:rPr>
+          <w:sz w:val="19"/>
+          <w:szCs w:val="19"/>
+        </w:rPr>
+        <w:t>Python, TypeScript, JavaScript, SQL, Bash</w:t>
+      </w:r>
+    </w:p>
+    <w:p>
+      <w:pPr>
+        <w:spacing w:after="22" w:line="236" w:lineRule="auto"/>
+        <w:ind w:left="20"/>
+      </w:pPr>
+      <w:r>
+        <w:rPr>
+          <w:b/>
+          <w:bCs/>
+          <w:color w:val="1A2B4A"/>
+          <w:sz w:val="19"/>
+          <w:szCs w:val="19"/>
+        </w:rPr>
         <w:t xml:space="preserve">Frameworks &amp; Libraries:  </w:t>
       </w:r>
       <w:r>
@@ -269,7 +292,7 @@
           <w:sz w:val="19"/>
           <w:szCs w:val="19"/>
         </w:rPr>
-        <w:t>FastAPI, Flask, Celery, APScheduler, gRPC, SQLAlchemy (async), LangGraph / LangChain, NeMo (TitaNet / FastConformer), faster-whisper, pyannote, Selenium, React, Next.js, React Native (Expo), Redux Toolkit</w:t>
+        <w:t>FastAPI, Flask, Celery, APScheduler, gRPC, SQLAlchemy (async), Selenium, React, Next.js, React Native (Expo), Redux Toolkit</w:t>
       </w:r>
     </w:p>
     <w:p>

</xml_diff>

<commit_message>
Polish Georgian copy: fix real errors and de-calque the phrasing
Native-reader pass over every Georgian string on the site. Fixes actual
grammar errors (wrong case on "ინსტრუმენტები, რომლებითაც", incomplete
"ჯერ არავის უთამაშია", missing verb in the footer) and replaces
word-for-word English calques that gave the copy away as machine-written
("მოდელი არასდროსაა შეზღუდვა", "data-quality კარიბჭე", "ღია ვარ … როლებისთვის").

Also drops the leftover "from architecture to deployment" claim from the
work section, and aligns the CV role line with the site's.

Co-Authored-By: Claude Opus 5 <noreply@anthropic.com>
</commit_message>
<xml_diff>
--- a/frontend/web/public/Vako_Mardaleishvili_CV.docx
+++ b/frontend/web/public/Vako_Mardaleishvili_CV.docx
@@ -408,19 +408,7 @@
         <w:t xml:space="preserve">  —  </w:t>
       </w:r>
       <w:r>
-        <w:rPr>
-          <w:lang w:val="en-US"/>
-        </w:rPr>
-        <w:t xml:space="preserve">AI </w:t>
-      </w:r>
-      <w:r>
         <w:t>Software Engineer (Backend &amp; AI</w:t>
-      </w:r>
-      <w:r>
-        <w:rPr>
-          <w:lang w:val="en-US"/>
-        </w:rPr>
-        <w:t xml:space="preserve"> &amp; Frontend</w:t>
       </w:r>
       <w:r>
         <w:t>)</w:t>

</xml_diff>

<commit_message>
CV: collapse the two stacked title lines into one, use Software Engineer
Was "Software Engineer" / "AI Engineer · Backend & Full-Stack · ..." on
separate lines, repeating "Engineer" twice. Now a single line: "Software
Engineer · Backend & Full-Stack · ...".

Co-Authored-By: Claude Sonnet 5 <noreply@anthropic.com>
</commit_message>
<xml_diff>
--- a/frontend/web/public/Vako_Mardaleishvili_CV.docx
+++ b/frontend/web/public/Vako_Mardaleishvili_CV.docx
@@ -26,32 +26,13 @@
       <w:pPr>
         <w:spacing w:after="60"/>
         <w:jc w:val="center"/>
+      </w:pPr>
+      <w:r>
         <w:rPr>
           <w:color w:val="5A6472"/>
           <w:spacing w:val="10"/>
-          <w:lang w:val="en-US"/>
-        </w:rPr>
-      </w:pPr>
-      <w:r>
-        <w:rPr>
-          <w:color w:val="5A6472"/>
-          <w:spacing w:val="10"/>
-          <w:lang w:val="en-US"/>
-        </w:rPr>
-        <w:t>Software Engineer</w:t>
-      </w:r>
-    </w:p>
-    <w:p>
-      <w:pPr>
-        <w:spacing w:after="60"/>
-        <w:jc w:val="center"/>
-      </w:pPr>
-      <w:r>
-        <w:rPr>
-          <w:color w:val="5A6472"/>
-          <w:spacing w:val="10"/>
-        </w:rPr>
-        <w:t>AI Engineer  ·  Backend &amp; Full-Stack  ·  Python · React / React Native · Applied LLM/ML (local &amp; API models)</w:t>
+        </w:rPr>
+        <w:t>Software Engineer  ·  Backend &amp; Full-Stack  ·  Python · React / React Native · Applied LLM/ML (local &amp; API models)</w:t>
       </w:r>
     </w:p>
     <w:p>

</xml_diff>